<commit_message>
Resume: Information Security Analyst (Identity & Access Management) @ Burns & McDonnell India (mid-tier)
</commit_message>
<xml_diff>
--- a/resumes/Resume_Information_Security_Analyst__Ident_Burns___McDonnell_India__mid-tier_.docx
+++ b/resumes/Resume_Information_Security_Analyst__Ident_Burns___McDonnell_India__mid-tier_.docx
@@ -413,7 +413,7 @@
           <w:sz w:val="19"/>
           <w:szCs w:val="19"/>
         </w:rPr>
-        <w:t>Triaged 50+ weekly inventory reimbursement cases by severity and policy eligibility, adhering to structured alert triage and escalation workflow.</w:t>
+        <w:t>Triaged 50+ weekly inventory reimbursement cases by severity and policy eligibility, ensuring compliance with structured case triage, escalation, and decision workflows.</w:t>
       </w:r>
     </w:p>
     <w:p>
@@ -432,7 +432,7 @@
           <w:sz w:val="19"/>
           <w:szCs w:val="19"/>
         </w:rPr>
-        <w:t>Performed root cause analysis on seller claims to identify policy violations and anomalous patterns; escalated findings to senior reviewers, demonstrating investigative instincts.</w:t>
+        <w:t>Conducted root cause analysis on seller claims, identifying policy violations and anomalous patterns, and escalated findings to senior reviewers for IAM policy refinement.</w:t>
       </w:r>
     </w:p>
     <w:p>
@@ -451,7 +451,7 @@
           <w:sz w:val="19"/>
           <w:szCs w:val="19"/>
         </w:rPr>
-        <w:t>Maintained audit-ready case documentation recording investigation findings, decisions, and corrective actions, establishing the evidence chain-of-custody discipline.</w:t>
+        <w:t>Maintained audit-ready case documentation recording investigation findings, decisions, evidence notes, and corrective actions to support IAM access governance.</w:t>
       </w:r>
     </w:p>
     <w:p>
@@ -470,7 +470,7 @@
           <w:sz w:val="19"/>
           <w:szCs w:val="19"/>
         </w:rPr>
-        <w:t>Spotted recurring fraud patterns across 200+ weekly cases and flagged them early — cutting repeat-issue investigation time.</w:t>
+        <w:t>Spotted recurring fraud patterns across 200+ weekly cases and flagged them early, reducing repeat-issue investigation time before escalation, thereby enhancing IAM risk management.</w:t>
       </w:r>
       <w:r>
         <w:rPr>
@@ -586,7 +586,7 @@
           <w:sz w:val="19"/>
           <w:szCs w:val="19"/>
         </w:rPr>
-        <w:t>Deployed Splunk SIEM with SPL searches for brute-force detection, lateral movement, and privilege escalation; mapped TTPs to MITRE ATT&amp;CK (T1110, T1078, T1059) and wrote incident report.</w:t>
+        <w:t>Deployed Splunk SIEM with SPL searches for brute-force detection, lateral movement, and privilege escalation (T1110, T1078, T1059); mapped TTPs and wrote incident report.</w:t>
       </w:r>
     </w:p>
     <w:p>
@@ -605,7 +605,7 @@
           <w:sz w:val="19"/>
           <w:szCs w:val="19"/>
         </w:rPr>
-        <w:t>Developed SOAR-style detection pipeline: Python script ingests Splunk alerts, enriches with VirusTotal IOC data, and dispatches Telegram notifications with severity classification.</w:t>
+        <w:t>Developed SOAR-style detection pipeline: Python script ingests Splunk alerts, enriches with VirusTotal API, and dispatches Telegram notifications with severity classification.</w:t>
       </w:r>
     </w:p>
     <w:p>
@@ -624,7 +624,7 @@
           <w:sz w:val="19"/>
           <w:szCs w:val="19"/>
         </w:rPr>
-        <w:t>Converted detection logic to Sigma rules (detection-as-code); performed TCP/IP analysis in Wireshark to detect SYN scans, DNS tunnelling, and plaintext credential exposure on unencrypted sessions.</w:t>
+        <w:t>Converted detection logic to Sigma rules; analyzed TCP/IP traffic in Wireshark for SYN scans, DNS tunnelling, and plaintext credential exposure.</w:t>
       </w:r>
     </w:p>
     <w:p>
@@ -694,7 +694,7 @@
           <w:sz w:val="19"/>
           <w:szCs w:val="19"/>
         </w:rPr>
-        <w:t>Built multi-API threat intelligence pipeline: submits suspicious data to VirusTotal, AbuseIPDB, and URLScan.io; cross-references WHOIS, DNS, and SSL details.</w:t>
+        <w:t>Built multi-API threat intelligence pipeline: submits suspicious data to VirusTotal, AbuseIPDB, and URLScan.io; cross-references WHOIS, DNS, and SSL details for unified phishing score.</w:t>
       </w:r>
     </w:p>
     <w:p>
@@ -713,7 +713,7 @@
           <w:sz w:val="19"/>
           <w:szCs w:val="19"/>
         </w:rPr>
-        <w:t>Developed typosquatting detector generating domain variants and checking DNS resolution to catch brand-impersonation attacks (T1110).</w:t>
+        <w:t>Developed typosquatting detector generating domain variants and checking live DNS resolution to catch brand-impersonation attacks.</w:t>
       </w:r>
     </w:p>
     <w:p>
@@ -732,7 +732,7 @@
           <w:sz w:val="19"/>
           <w:szCs w:val="19"/>
         </w:rPr>
-        <w:t>Deployed Telegram bot interface for live IOC enrichment, supporting bulk CSV input/output and OSINT enrichment via theHarvester.</w:t>
+        <w:t>Deployed Telegram bot interface for live IOC enrichment, supporting bulk CSV input/output and OSINT enrichment via theHarvester for domain profiling.</w:t>
       </w:r>
     </w:p>
     <w:p>
@@ -868,7 +868,7 @@
           <w:sz w:val="19"/>
           <w:szCs w:val="19"/>
         </w:rPr>
-        <w:t>Python, Bash (basic), boto3, regular expressions, Access, Management, Risk</w:t>
+        <w:t>Python, Bash (basic), boto3, regular expressions, Access, Management, Compliance</w:t>
       </w:r>
     </w:p>
     <w:p>

</xml_diff>